<commit_message>
docs: phuong an van hanh toi gian — 1 VPS + Dokploy + ten mien (MongoDB/MinIO tren VPS), cap nhat bao cao md + Word
</commit_message>
<xml_diff>
--- a/docs/Bao-Cao-Du-An.docx
+++ b/docs/Bao-Cao-Du-An.docx
@@ -396,7 +396,7 @@
               <w:spacing w:after="40"/>
             </w:pPr>
             <w:r>
-              <w:t xml:space="preserve">~400.000–800.000 VNĐ/tháng (domain, hosting, hạ tầng — chi tiết Mục 8)</w:t>
+              <w:t xml:space="preserve">~200.000–500.000 VNĐ/tháng (1 VPS chạy Dokploy + tên miền — chi tiết Mục 8)</w:t>
             </w:r>
           </w:p>
         </w:tc>
@@ -1267,7 +1267,7 @@
               <w:spacing w:after="40"/>
             </w:pPr>
             <w:r>
-              <w:t xml:space="preserve">MongoDB Atlas (Mongoose 9)</w:t>
+              <w:t xml:space="preserve">MongoDB (Mongoose 9) — chạy trong Docker trên VPS (không cần Atlas trả phí)</w:t>
             </w:r>
           </w:p>
         </w:tc>
@@ -1330,26 +1330,36 @@
               <w:spacing w:after="40"/>
             </w:pPr>
             <w:r>
-              <w:t xml:space="preserve">Cloudflare R2 (URL ký tạm — presigned URL)</w:t>
-            </w:r>
-          </w:p>
-        </w:tc>
-        <w:tc>
-          <w:tcPr>
-            <w:tcW w:type="dxa" w:w="3213"/>
-            <w:tcMar>
-              <w:top w:type="dxa" w:w="80"/>
-              <w:left w:type="dxa" w:w="100"/>
-              <w:bottom w:type="dxa" w:w="80"/>
-              <w:right w:type="dxa" w:w="100"/>
-            </w:tcMar>
-          </w:tcPr>
-          <w:p>
-            <w:pPr>
-              <w:spacing w:after="40"/>
-            </w:pPr>
-            <w:r>
-              <w:t xml:space="preserve">File không nằm trên server web — an toàn, tiết kiệm băng thông</w:t>
+              <w:t xml:space="preserve">MinIO (S3 tương thích) chạy trên VPS — hoặc Cloudflare R2 gói miễn phí 10GB</w:t>
+            </w:r>
+          </w:p>
+        </w:tc>
+        <w:tc>
+          <w:tcPr>
+            <w:tcW w:type="dxa" w:w="3213"/>
+            <w:tcMar>
+              <w:top w:type="dxa" w:w="80"/>
+              <w:left w:type="dxa" w:w="100"/>
+              <w:bottom w:type="dxa" w:w="80"/>
+              <w:right w:type="dxa" w:w="100"/>
+            </w:tcMar>
+          </w:tcPr>
+          <w:p>
+            <w:pPr>
+              <w:spacing w:after="40"/>
+            </w:pPr>
+            <w:r>
+              <w:t xml:space="preserve">File gửi qua </w:t>
+            </w:r>
+            <w:r>
+              <w:rPr>
+                <w:b/>
+                <w:bCs/>
+              </w:rPr>
+              <w:t xml:space="preserve">URL ký tạm (presigned)</w:t>
+            </w:r>
+            <w:r>
+              <w:t xml:space="preserve"> — code không đổi, chỉ đổi endpoint</w:t>
             </w:r>
           </w:p>
         </w:tc>
@@ -1519,26 +1529,36 @@
               <w:spacing w:after="40"/>
             </w:pPr>
             <w:r>
-              <w:t xml:space="preserve">VPS Linux (Node.js) hoặc Vercel</w:t>
-            </w:r>
-          </w:p>
-        </w:tc>
-        <w:tc>
-          <w:tcPr>
-            <w:tcW w:type="dxa" w:w="3213"/>
-            <w:tcMar>
-              <w:top w:type="dxa" w:w="80"/>
-              <w:left w:type="dxa" w:w="100"/>
-              <w:bottom w:type="dxa" w:w="80"/>
-              <w:right w:type="dxa" w:w="100"/>
-            </w:tcMar>
-          </w:tcPr>
-          <w:p>
-            <w:pPr>
-              <w:spacing w:after="40"/>
-            </w:pPr>
-            <w:r>
-              <w:t xml:space="preserve">Tùy chọn theo chi phí</w:t>
+              <w:t xml:space="preserve">1 VPS Linux chạy </w:t>
+            </w:r>
+            <w:r>
+              <w:rPr>
+                <w:b/>
+                <w:bCs/>
+              </w:rPr>
+              <w:t xml:space="preserve">Dokploy</w:t>
+            </w:r>
+            <w:r>
+              <w:t xml:space="preserve"> (miễn phí, nguồn mở) — Docker quản lý app + MongoDB + MinIO, Traefik cấp SSL tự động (Let's Encrypt)</w:t>
+            </w:r>
+          </w:p>
+        </w:tc>
+        <w:tc>
+          <w:tcPr>
+            <w:tcW w:type="dxa" w:w="3213"/>
+            <w:tcMar>
+              <w:top w:type="dxa" w:w="80"/>
+              <w:left w:type="dxa" w:w="100"/>
+              <w:bottom w:type="dxa" w:w="80"/>
+              <w:right w:type="dxa" w:w="100"/>
+            </w:tcMar>
+          </w:tcPr>
+          <w:p>
+            <w:pPr>
+              <w:spacing w:after="40"/>
+            </w:pPr>
+            <w:r>
+              <w:t xml:space="preserve">Chi phí = 1 VPS + tên miền</w:t>
             </w:r>
           </w:p>
         </w:tc>
@@ -6078,7 +6098,7 @@
               <w:spacing w:after="40"/>
             </w:pPr>
             <w:r>
-              <w:t xml:space="preserve">Xuất báo cáo doanh thu từ Dashboard; kiểm tra dung lượng R2 &amp; Atlas; sao lưu dữ liệu (MongoDB Atlas backup tự động miễn phí 24h gần nhất); rà bảng giá/khuyến mãi</w:t>
+              <w:t xml:space="preserve">Xuất báo cáo doanh thu từ Dashboard; kiểm tra dung lượng ổ đĩa VPS (file bản vẽ + DB); kiểm tra phiên backup tự động; rà bảng giá/khuyến mãi</w:t>
             </w:r>
           </w:p>
         </w:tc>
@@ -6238,7 +6258,7 @@
         <w:spacing w:after="120" w:before="240"/>
       </w:pPr>
       <w:r>
-        <w:t xml:space="preserve">6.4. Sao lưu &amp; phục hồi</w:t>
+        <w:t xml:space="preserve">6.4. Sao lưu &amp; phục hồi (phương án 1 VPS)</w:t>
       </w:r>
     </w:p>
     <w:p>
@@ -6255,10 +6275,20 @@
           <w:b/>
           <w:bCs/>
         </w:rPr>
-        <w:t xml:space="preserve">MongoDB Atlas</w:t>
-      </w:r>
-      <w:r>
-        <w:t xml:space="preserve"> (M0): backup tự động ~24h gần nhất, miễn phí — có thể phục hồi 1 click trong Console Atlas.</w:t>
+        <w:t xml:space="preserve">MongoDB (Docker trên VPS)</w:t>
+      </w:r>
+      <w:r>
+        <w:t xml:space="preserve">: bên triển khai cài sẵn </w:t>
+      </w:r>
+      <w:r>
+        <w:rPr>
+          <w:b/>
+          <w:bCs/>
+        </w:rPr>
+        <w:t xml:space="preserve">job sao lưu tự động</w:t>
+      </w:r>
+      <w:r>
+        <w:t xml:space="preserve"> (mongodump chạy cron hằng đêm, giữ 7 phiên bản gần nhất) — khôi phục bằng 1 lệnh khi cần.</w:t>
       </w:r>
     </w:p>
     <w:p>
@@ -6275,10 +6305,10 @@
           <w:b/>
           <w:bCs/>
         </w:rPr>
-        <w:t xml:space="preserve">File R2</w:t>
-      </w:r>
-      <w:r>
-        <w:t xml:space="preserve">: dữ liệu bản vẽ gốc + ảnh — nên tải về giữ bản sao local mỗi khi bộ sưu tập lớn (khuyến nghị tháng/lần).</w:t>
+        <w:t xml:space="preserve">File bản vẽ + ảnh (MinIO)</w:t>
+      </w:r>
+      <w:r>
+        <w:t xml:space="preserve">: đồng bộ volume MinIO sang thư mục backup trên VPS hoặc tải về máy local (khuyến nghị tháng/lần, nhất là khi bộ sưu tập lớn).</w:t>
       </w:r>
     </w:p>
     <w:p>
@@ -6298,7 +6328,7 @@
         <w:t xml:space="preserve">Mật khẩu/quyền</w:t>
       </w:r>
       <w:r>
-        <w:t xml:space="preserve">: nếu quên mật khẩu admin — đổi </w:t>
+        <w:t xml:space="preserve">: quên mật khẩu admin → đổi </w:t>
       </w:r>
       <w:r>
         <w:rPr>
@@ -6322,7 +6352,7 @@
         <w:t xml:space="preserve">.env</w:t>
       </w:r>
       <w:r>
-        <w:t xml:space="preserve">, xóa user admin trên Atlas, chạy </w:t>
+        <w:t xml:space="preserve">, xóa user admin trong DB, chạy </w:t>
       </w:r>
       <w:r>
         <w:rPr>
@@ -6592,7 +6622,7 @@
               <w:spacing w:after="40"/>
             </w:pPr>
             <w:r>
-              <w:t xml:space="preserve">Không kết nối được DB</w:t>
+              <w:t xml:space="preserve">Không kết nối được DB / MinIO</w:t>
             </w:r>
           </w:p>
         </w:tc>
@@ -6630,7 +6660,16 @@
               <w:spacing w:after="40"/>
             </w:pPr>
             <w:r>
-              <w:t xml:space="preserve">Kiểm tra IP whitelist trong Atlas Console (mạng đổi IP vẫn truy cập được trước đây)</w:t>
+              <w:rPr>
+                <w:rFonts w:ascii="Consolas" w:cs="Consolas" w:eastAsia="Consolas" w:hAnsi="Consolas"/>
+                <w:color w:val="84211A"/>
+                <w:sz w:val="20"/>
+                <w:szCs w:val="20"/>
+              </w:rPr>
+              <w:t xml:space="preserve">docker compose restart mongo minio</w:t>
+            </w:r>
+            <w:r>
+              <w:t xml:space="preserve"> trên VPS (Dokploy); kiểm tra dung lượng ổ đĩa</w:t>
             </w:r>
           </w:p>
         </w:tc>
@@ -8268,7 +8307,7 @@
         <w:spacing w:after="120" w:before="240"/>
       </w:pPr>
       <w:r>
-        <w:t xml:space="preserve">8.1. Bảng chi phí vận hành (ước tính)</w:t>
+        <w:t xml:space="preserve">8.1. Bảng chi phí vận hành (phương án tối giản — 1 VPS + tên miền)</w:t>
       </w:r>
     </w:p>
     <w:tbl>
@@ -8484,7 +8523,7 @@
               <w:spacing w:after="40"/>
             </w:pPr>
             <w:r>
-              <w:t xml:space="preserve">Không bắt buộc khi mới chạy thử local</w:t>
+              <w:t xml:space="preserve">Chỉ ~20.000–35.000 VNĐ/tháng quy đổi</w:t>
             </w:r>
           </w:p>
         </w:tc>
@@ -8505,7 +8544,21 @@
               <w:spacing w:after="40"/>
             </w:pPr>
             <w:r>
-              <w:t xml:space="preserve">Hosting / VPS (2GB RAM, Linux)</w:t>
+              <w:rPr>
+                <w:b/>
+                <w:bCs/>
+              </w:rPr>
+              <w:t xml:space="preserve">1 VPS Linux</w:t>
+            </w:r>
+            <w:r>
+              <w:t xml:space="preserve"> chạy </w:t>
+            </w:r>
+            <w:r>
+              <w:rPr>
+                <w:b/>
+                <w:bCs/>
+              </w:rPr>
+              <w:t xml:space="preserve">Dokploy</w:t>
             </w:r>
           </w:p>
         </w:tc>
@@ -8524,7 +8577,7 @@
               <w:spacing w:after="40"/>
             </w:pPr>
             <w:r>
-              <w:t xml:space="preserve">VPS trong nước (Vietnix, AZDIGI…) hoặc Vercel</w:t>
+              <w:t xml:space="preserve">VPS trong nước (Vietnix, AZDIGI, VNG Cloud…)</w:t>
             </w:r>
           </w:p>
         </w:tc>
@@ -8543,7 +8596,7 @@
               <w:spacing w:after="40"/>
             </w:pPr>
             <w:r>
-              <w:t xml:space="preserve">~350.000–700.000 VNĐ</w:t>
+              <w:t xml:space="preserve">~200.000–450.000 VNĐ</w:t>
             </w:r>
           </w:p>
         </w:tc>
@@ -8581,7 +8634,7 @@
               <w:spacing w:after="40"/>
             </w:pPr>
             <w:r>
-              <w:t xml:space="preserve">Dự án Việt Nam nên ưu tiên VPS trong nước cho tốc độ &amp; hỗ trợ</w:t>
+              <w:t xml:space="preserve">RAM 2–4GB đủ chạy: app + MongoDB + MinIO + Dokploy/Traefik</w:t>
             </w:r>
           </w:p>
         </w:tc>
@@ -8602,7 +8655,7 @@
               <w:spacing w:after="40"/>
             </w:pPr>
             <w:r>
-              <w:t xml:space="preserve">MongoDB Atlas M0 (512MB)</w:t>
+              <w:t xml:space="preserve">MongoDB (Docker trên VPS)</w:t>
             </w:r>
           </w:p>
         </w:tc>
@@ -8621,7 +8674,7 @@
               <w:spacing w:after="40"/>
             </w:pPr>
             <w:r>
-              <w:t xml:space="preserve">MongoDB</w:t>
+              <w:t xml:space="preserve">Tự cài qua Dokploy</w:t>
             </w:r>
           </w:p>
         </w:tc>
@@ -8682,7 +8735,7 @@
               <w:spacing w:after="40"/>
             </w:pPr>
             <w:r>
-              <w:t xml:space="preserve">Miễn phí; khi vượt 512MB nâng gói trả phí ~$57–108/tháng cho M10</w:t>
+              <w:t xml:space="preserve">Miễn phí, không lo hạn mức 512MB của Atlas</w:t>
             </w:r>
           </w:p>
         </w:tc>
@@ -8703,7 +8756,7 @@
               <w:spacing w:after="40"/>
             </w:pPr>
             <w:r>
-              <w:t xml:space="preserve">Cloudflare R2 (10GB)</w:t>
+              <w:t xml:space="preserve">MinIO (S3, Docker trên VPS)</w:t>
             </w:r>
           </w:p>
         </w:tc>
@@ -8722,205 +8775,7 @@
               <w:spacing w:after="40"/>
             </w:pPr>
             <w:r>
-              <w:t xml:space="preserve">Cloudflare</w:t>
-            </w:r>
-          </w:p>
-        </w:tc>
-        <w:tc>
-          <w:tcPr>
-            <w:tcW w:type="dxa" w:w="1928"/>
-            <w:tcMar>
-              <w:top w:type="dxa" w:w="80"/>
-              <w:left w:type="dxa" w:w="100"/>
-              <w:bottom w:type="dxa" w:w="80"/>
-              <w:right w:type="dxa" w:w="100"/>
-            </w:tcMar>
-          </w:tcPr>
-          <w:p>
-            <w:pPr>
-              <w:spacing w:after="40"/>
-            </w:pPr>
-            <w:r>
-              <w:rPr>
-                <w:b/>
-                <w:bCs/>
-              </w:rPr>
-              <w:t xml:space="preserve">~0 VNĐ</w:t>
-            </w:r>
-          </w:p>
-        </w:tc>
-        <w:tc>
-          <w:tcPr>
-            <w:tcW w:type="dxa" w:w="1928"/>
-            <w:tcMar>
-              <w:top w:type="dxa" w:w="80"/>
-              <w:left w:type="dxa" w:w="100"/>
-              <w:bottom w:type="dxa" w:w="80"/>
-              <w:right w:type="dxa" w:w="100"/>
-            </w:tcMar>
-          </w:tcPr>
-          <w:p>
-            <w:pPr>
-              <w:spacing w:after="40"/>
-            </w:pPr>
-            <w:r>
-              <w:t xml:space="preserve">Tháng</w:t>
-            </w:r>
-          </w:p>
-        </w:tc>
-        <w:tc>
-          <w:tcPr>
-            <w:tcW w:type="dxa" w:w="1928"/>
-            <w:tcMar>
-              <w:top w:type="dxa" w:w="80"/>
-              <w:left w:type="dxa" w:w="100"/>
-              <w:bottom w:type="dxa" w:w="80"/>
-              <w:right w:type="dxa" w:w="100"/>
-            </w:tcMar>
-          </w:tcPr>
-          <w:p>
-            <w:pPr>
-              <w:spacing w:after="40"/>
-            </w:pPr>
-            <w:r>
-              <w:t xml:space="preserve">Miễn phí 10GB + 1 triệu thao tác đọc/ghi/tháng; trả theo dung lượng vượt</w:t>
-            </w:r>
-          </w:p>
-        </w:tc>
-      </w:tr>
-      <w:tr>
-        <w:tc>
-          <w:tcPr>
-            <w:tcW w:type="dxa" w:w="1928"/>
-            <w:tcMar>
-              <w:top w:type="dxa" w:w="80"/>
-              <w:left w:type="dxa" w:w="100"/>
-              <w:bottom w:type="dxa" w:w="80"/>
-              <w:right w:type="dxa" w:w="100"/>
-            </w:tcMar>
-          </w:tcPr>
-          <w:p>
-            <w:pPr>
-              <w:spacing w:after="40"/>
-            </w:pPr>
-            <w:r>
-              <w:t xml:space="preserve">VNPay</w:t>
-            </w:r>
-          </w:p>
-        </w:tc>
-        <w:tc>
-          <w:tcPr>
-            <w:tcW w:type="dxa" w:w="1928"/>
-            <w:tcMar>
-              <w:top w:type="dxa" w:w="80"/>
-              <w:left w:type="dxa" w:w="100"/>
-              <w:bottom w:type="dxa" w:w="80"/>
-              <w:right w:type="dxa" w:w="100"/>
-            </w:tcMar>
-          </w:tcPr>
-          <w:p>
-            <w:pPr>
-              <w:spacing w:after="40"/>
-            </w:pPr>
-            <w:r>
-              <w:t xml:space="preserve">VNPay</w:t>
-            </w:r>
-          </w:p>
-        </w:tc>
-        <w:tc>
-          <w:tcPr>
-            <w:tcW w:type="dxa" w:w="1928"/>
-            <w:tcMar>
-              <w:top w:type="dxa" w:w="80"/>
-              <w:left w:type="dxa" w:w="100"/>
-              <w:bottom w:type="dxa" w:w="80"/>
-              <w:right w:type="dxa" w:w="100"/>
-            </w:tcMar>
-          </w:tcPr>
-          <w:p>
-            <w:pPr>
-              <w:spacing w:after="40"/>
-            </w:pPr>
-            <w:r>
-              <w:t xml:space="preserve">Phí giao dịch (thường ~0,4–1% + mức tối thiểu)</w:t>
-            </w:r>
-          </w:p>
-        </w:tc>
-        <w:tc>
-          <w:tcPr>
-            <w:tcW w:type="dxa" w:w="1928"/>
-            <w:tcMar>
-              <w:top w:type="dxa" w:w="80"/>
-              <w:left w:type="dxa" w:w="100"/>
-              <w:bottom w:type="dxa" w:w="80"/>
-              <w:right w:type="dxa" w:w="100"/>
-            </w:tcMar>
-          </w:tcPr>
-          <w:p>
-            <w:pPr>
-              <w:spacing w:after="40"/>
-            </w:pPr>
-            <w:r>
-              <w:t xml:space="preserve">Theo giao dịch</w:t>
-            </w:r>
-          </w:p>
-        </w:tc>
-        <w:tc>
-          <w:tcPr>
-            <w:tcW w:type="dxa" w:w="1928"/>
-            <w:tcMar>
-              <w:top w:type="dxa" w:w="80"/>
-              <w:left w:type="dxa" w:w="100"/>
-              <w:bottom w:type="dxa" w:w="80"/>
-              <w:right w:type="dxa" w:w="100"/>
-            </w:tcMar>
-          </w:tcPr>
-          <w:p>
-            <w:pPr>
-              <w:spacing w:after="40"/>
-            </w:pPr>
-            <w:r>
-              <w:t xml:space="preserve">Sandbox miễn phí; production có hợp đồng merchant</w:t>
-            </w:r>
-          </w:p>
-        </w:tc>
-      </w:tr>
-      <w:tr>
-        <w:tc>
-          <w:tcPr>
-            <w:tcW w:type="dxa" w:w="1928"/>
-            <w:tcMar>
-              <w:top w:type="dxa" w:w="80"/>
-              <w:left w:type="dxa" w:w="100"/>
-              <w:bottom w:type="dxa" w:w="80"/>
-              <w:right w:type="dxa" w:w="100"/>
-            </w:tcMar>
-          </w:tcPr>
-          <w:p>
-            <w:pPr>
-              <w:spacing w:after="40"/>
-            </w:pPr>
-            <w:r>
-              <w:t xml:space="preserve">Google OAuth / SSL / khác</w:t>
-            </w:r>
-          </w:p>
-        </w:tc>
-        <w:tc>
-          <w:tcPr>
-            <w:tcW w:type="dxa" w:w="1928"/>
-            <w:tcMar>
-              <w:top w:type="dxa" w:w="80"/>
-              <w:left w:type="dxa" w:w="100"/>
-              <w:bottom w:type="dxa" w:w="80"/>
-              <w:right w:type="dxa" w:w="100"/>
-            </w:tcMar>
-          </w:tcPr>
-          <w:p>
-            <w:pPr>
-              <w:spacing w:after="40"/>
-            </w:pPr>
-            <w:r>
-              <w:t xml:space="preserve">Google, Let's Encrypt</w:t>
+              <w:t xml:space="preserve">Tự cài qua Dokploy</w:t>
             </w:r>
           </w:p>
         </w:tc>
@@ -8981,7 +8836,205 @@
               <w:spacing w:after="40"/>
             </w:pPr>
             <w:r>
-              <w:t xml:space="preserve">SSL miễn phí qua Let's Encrypt</w:t>
+              <w:t xml:space="preserve">Lưu file bản vẽ + ảnh ngay trên VPS</w:t>
+            </w:r>
+          </w:p>
+        </w:tc>
+      </w:tr>
+      <w:tr>
+        <w:tc>
+          <w:tcPr>
+            <w:tcW w:type="dxa" w:w="1928"/>
+            <w:tcMar>
+              <w:top w:type="dxa" w:w="80"/>
+              <w:left w:type="dxa" w:w="100"/>
+              <w:bottom w:type="dxa" w:w="80"/>
+              <w:right w:type="dxa" w:w="100"/>
+            </w:tcMar>
+          </w:tcPr>
+          <w:p>
+            <w:pPr>
+              <w:spacing w:after="40"/>
+            </w:pPr>
+            <w:r>
+              <w:t xml:space="preserve">Giấy chứng nhận SSL</w:t>
+            </w:r>
+          </w:p>
+        </w:tc>
+        <w:tc>
+          <w:tcPr>
+            <w:tcW w:type="dxa" w:w="1928"/>
+            <w:tcMar>
+              <w:top w:type="dxa" w:w="80"/>
+              <w:left w:type="dxa" w:w="100"/>
+              <w:bottom w:type="dxa" w:w="80"/>
+              <w:right w:type="dxa" w:w="100"/>
+            </w:tcMar>
+          </w:tcPr>
+          <w:p>
+            <w:pPr>
+              <w:spacing w:after="40"/>
+            </w:pPr>
+            <w:r>
+              <w:t xml:space="preserve">Let's Encrypt (Dokploy cấp tự động)</w:t>
+            </w:r>
+          </w:p>
+        </w:tc>
+        <w:tc>
+          <w:tcPr>
+            <w:tcW w:type="dxa" w:w="1928"/>
+            <w:tcMar>
+              <w:top w:type="dxa" w:w="80"/>
+              <w:left w:type="dxa" w:w="100"/>
+              <w:bottom w:type="dxa" w:w="80"/>
+              <w:right w:type="dxa" w:w="100"/>
+            </w:tcMar>
+          </w:tcPr>
+          <w:p>
+            <w:pPr>
+              <w:spacing w:after="40"/>
+            </w:pPr>
+            <w:r>
+              <w:rPr>
+                <w:b/>
+                <w:bCs/>
+              </w:rPr>
+              <w:t xml:space="preserve">0 VNĐ</w:t>
+            </w:r>
+          </w:p>
+        </w:tc>
+        <w:tc>
+          <w:tcPr>
+            <w:tcW w:type="dxa" w:w="1928"/>
+            <w:tcMar>
+              <w:top w:type="dxa" w:w="80"/>
+              <w:left w:type="dxa" w:w="100"/>
+              <w:bottom w:type="dxa" w:w="80"/>
+              <w:right w:type="dxa" w:w="100"/>
+            </w:tcMar>
+          </w:tcPr>
+          <w:p>
+            <w:pPr>
+              <w:spacing w:after="40"/>
+            </w:pPr>
+            <w:r>
+              <w:t xml:space="preserve">—</w:t>
+            </w:r>
+          </w:p>
+        </w:tc>
+        <w:tc>
+          <w:tcPr>
+            <w:tcW w:type="dxa" w:w="1928"/>
+            <w:tcMar>
+              <w:top w:type="dxa" w:w="80"/>
+              <w:left w:type="dxa" w:w="100"/>
+              <w:bottom w:type="dxa" w:w="80"/>
+              <w:right w:type="dxa" w:w="100"/>
+            </w:tcMar>
+          </w:tcPr>
+          <w:p>
+            <w:pPr>
+              <w:spacing w:after="40"/>
+            </w:pPr>
+            <w:r>
+              <w:t xml:space="preserve">HTTPS tự động</w:t>
+            </w:r>
+          </w:p>
+        </w:tc>
+      </w:tr>
+      <w:tr>
+        <w:tc>
+          <w:tcPr>
+            <w:tcW w:type="dxa" w:w="1928"/>
+            <w:tcMar>
+              <w:top w:type="dxa" w:w="80"/>
+              <w:left w:type="dxa" w:w="100"/>
+              <w:bottom w:type="dxa" w:w="80"/>
+              <w:right w:type="dxa" w:w="100"/>
+            </w:tcMar>
+          </w:tcPr>
+          <w:p>
+            <w:pPr>
+              <w:spacing w:after="40"/>
+            </w:pPr>
+            <w:r>
+              <w:t xml:space="preserve">VNPay</w:t>
+            </w:r>
+          </w:p>
+        </w:tc>
+        <w:tc>
+          <w:tcPr>
+            <w:tcW w:type="dxa" w:w="1928"/>
+            <w:tcMar>
+              <w:top w:type="dxa" w:w="80"/>
+              <w:left w:type="dxa" w:w="100"/>
+              <w:bottom w:type="dxa" w:w="80"/>
+              <w:right w:type="dxa" w:w="100"/>
+            </w:tcMar>
+          </w:tcPr>
+          <w:p>
+            <w:pPr>
+              <w:spacing w:after="40"/>
+            </w:pPr>
+            <w:r>
+              <w:t xml:space="preserve">VNPay</w:t>
+            </w:r>
+          </w:p>
+        </w:tc>
+        <w:tc>
+          <w:tcPr>
+            <w:tcW w:type="dxa" w:w="1928"/>
+            <w:tcMar>
+              <w:top w:type="dxa" w:w="80"/>
+              <w:left w:type="dxa" w:w="100"/>
+              <w:bottom w:type="dxa" w:w="80"/>
+              <w:right w:type="dxa" w:w="100"/>
+            </w:tcMar>
+          </w:tcPr>
+          <w:p>
+            <w:pPr>
+              <w:spacing w:after="40"/>
+            </w:pPr>
+            <w:r>
+              <w:t xml:space="preserve">Phí giao dịch (thường ~0,4–1% mỗi đơn)</w:t>
+            </w:r>
+          </w:p>
+        </w:tc>
+        <w:tc>
+          <w:tcPr>
+            <w:tcW w:type="dxa" w:w="1928"/>
+            <w:tcMar>
+              <w:top w:type="dxa" w:w="80"/>
+              <w:left w:type="dxa" w:w="100"/>
+              <w:bottom w:type="dxa" w:w="80"/>
+              <w:right w:type="dxa" w:w="100"/>
+            </w:tcMar>
+          </w:tcPr>
+          <w:p>
+            <w:pPr>
+              <w:spacing w:after="40"/>
+            </w:pPr>
+            <w:r>
+              <w:t xml:space="preserve">Theo giao dịch</w:t>
+            </w:r>
+          </w:p>
+        </w:tc>
+        <w:tc>
+          <w:tcPr>
+            <w:tcW w:type="dxa" w:w="1928"/>
+            <w:tcMar>
+              <w:top w:type="dxa" w:w="80"/>
+              <w:left w:type="dxa" w:w="100"/>
+              <w:bottom w:type="dxa" w:w="80"/>
+              <w:right w:type="dxa" w:w="100"/>
+            </w:tcMar>
+          </w:tcPr>
+          <w:p>
+            <w:pPr>
+              <w:spacing w:after="40"/>
+            </w:pPr>
+            <w:r>
+              <w:t xml:space="preserve">Sandbox miễn phí; production có hợp đồng merchant</w:t>
             </w:r>
           </w:p>
         </w:tc>
@@ -9045,7 +9098,7 @@
                 <w:b/>
                 <w:bCs/>
               </w:rPr>
-              <w:t xml:space="preserve">~400.000–800.000 VNĐ/tháng</w:t>
+              <w:t xml:space="preserve">~200.000–500.000 VNĐ/tháng</w:t>
             </w:r>
           </w:p>
         </w:tc>
@@ -9079,6 +9132,13 @@
             <w:pPr>
               <w:spacing w:after="40"/>
             </w:pPr>
+            <w:r>
+              <w:rPr>
+                <w:b/>
+                <w:bCs/>
+              </w:rPr>
+              <w:t xml:space="preserve">Chỉ 2 khoản: VPS + tên miền</w:t>
+            </w:r>
           </w:p>
         </w:tc>
       </w:tr>
@@ -9087,6 +9147,35 @@
       <w:pPr>
         <w:spacing w:after="160"/>
       </w:pPr>
+    </w:p>
+    <w:p>
+      <w:pPr>
+        <w:spacing w:after="120"/>
+        <w:ind w:left="480"/>
+      </w:pPr>
+      <w:r>
+        <w:t xml:space="preserve">💡 </w:t>
+      </w:r>
+      <w:r>
+        <w:rPr>
+          <w:b/>
+          <w:bCs/>
+        </w:rPr>
+        <w:t xml:space="preserve">So với phương án cũ</w:t>
+      </w:r>
+      <w:r>
+        <w:t xml:space="preserve"> (MongoDB Atlas trả phí + Cloudflare R2): với phương án 1 VPS, mọi chi phí ngoài chỉ gồm </w:t>
+      </w:r>
+      <w:r>
+        <w:rPr>
+          <w:b/>
+          <w:bCs/>
+        </w:rPr>
+        <w:t xml:space="preserve">VPS + tên miền</w:t>
+      </w:r>
+      <w:r>
+        <w:t xml:space="preserve">. Nhược điểm duy nhất: tự lo backup (đã cài sẵn job sao lưu tự động hằng đêm) và sự cố dồn về 1 máy — phù hợp quy mô shop nhỏ/khởi nghiệp.</w:t>
+      </w:r>
     </w:p>
     <w:p>
       <w:pPr>
@@ -9192,7 +9281,7 @@
               <w:spacing w:after="40"/>
             </w:pPr>
             <w:r>
-              <w:t xml:space="preserve">Tên miền, hosting/VPS, tài khoản Atlas, R2, VNPay</w:t>
+              <w:t xml:space="preserve">Tên miền + VPS Dokploy (toàn bộ chi phí hạ tầng)</w:t>
             </w:r>
           </w:p>
         </w:tc>
@@ -9234,7 +9323,7 @@
               <w:spacing w:after="40"/>
             </w:pPr>
             <w:r>
-              <w:t xml:space="preserve">Là chi phí hạ tầng định kỳ gắn với hoạt động kinh doanh của khách; khách sở hữu tài khoản → làm chủ dữ liệu</w:t>
+              <w:t xml:space="preserve">Khách sở hữu VPS + domain → làm chủ dữ liệu &amp; code hoàn toàn</w:t>
             </w:r>
           </w:p>
         </w:tc>
@@ -9523,14 +9612,14 @@
         <w:t xml:space="preserve">chất lượng phần mềm</w:t>
       </w:r>
       <w:r>
-        <w:t xml:space="preserve"> (viết đúng, sửa lỗi, bảo trì code); bên thuê chịu trách nhiệm </w:t>
+        <w:t xml:space="preserve"> (viết đúng, sửa lỗi, bảo trì code, cài đặt &amp; giám sát hạ tầng trong phạm vi bảo hành); bên thuê chịu </w:t>
       </w:r>
       <w:r>
         <w:rPr>
           <w:b/>
           <w:bCs/>
         </w:rPr>
-        <w:t xml:space="preserve">chi phí hạ tầng &amp; nội dung kinh doanh</w:t>
+        <w:t xml:space="preserve">chi phí thuê hạ tầng &amp; nội dung kinh doanh</w:t>
       </w:r>
       <w:r>
         <w:t xml:space="preserve"> (đăng file, giá bán, marketing…).</w:t>
@@ -12080,7 +12169,7 @@
         <w:t xml:space="preserve">URL ký tạm có thời hạn</w:t>
       </w:r>
       <w:r>
-        <w:t xml:space="preserve"> (R2 presigned). Kẻ dò đường dẫn không thể tải được file.</w:t>
+        <w:t xml:space="preserve"> (presigned — MinIO/R2). Kẻ dò đường dẫn không thể tải được file.</w:t>
       </w:r>
     </w:p>
     <w:p>
@@ -12152,7 +12241,7 @@
         <w:t xml:space="preserve">Dữ liệu</w:t>
       </w:r>
       <w:r>
-        <w:t xml:space="preserve">: dữ liệu thuộc về khách hàng — bàn giao toàn bộ tài khoản DB/R2 khi kết thúc.</w:t>
+        <w:t xml:space="preserve">: dữ liệu thuộc về khách hàng — bàn giao toàn bộ DB/file code khi kết thúc.</w:t>
       </w:r>
     </w:p>
     <w:p>
@@ -12345,7 +12434,17 @@
               <w:spacing w:after="40"/>
             </w:pPr>
             <w:r>
-              <w:t xml:space="preserve">Khách cung cấp: tên miền, tài khoản hosting/VPS, tài khoản </w:t>
+              <w:t xml:space="preserve">Khách cung cấp: </w:t>
+            </w:r>
+            <w:r>
+              <w:rPr>
+                <w:b/>
+                <w:bCs/>
+              </w:rPr>
+              <w:t xml:space="preserve">1 VPS Linux + tên miền</w:t>
+            </w:r>
+            <w:r>
+              <w:t xml:space="preserve"> (đăng ký tài khoản VPS trong nước), tài khoản </w:t>
             </w:r>
             <w:r>
               <w:rPr>
@@ -12355,7 +12454,7 @@
               <w:t xml:space="preserve">VNPay production</w:t>
             </w:r>
             <w:r>
-              <w:t xml:space="preserve"> (hợp đồng merchant), tài khoản Atlas/R2 (hoặc bên triển khai tạo giúp)</w:t>
+              <w:t xml:space="preserve"> (hợp đồng merchant); hoặc bên triển khai đặt VPS giúp</w:t>
             </w:r>
           </w:p>
         </w:tc>
@@ -12414,7 +12513,17 @@
               <w:spacing w:after="40"/>
             </w:pPr>
             <w:r>
-              <w:t xml:space="preserve">Bên triển khai: cấu hình production (HTTPS, env, VNPay thật, IP whitelist), chạy kiểm thử đầy đủ</w:t>
+              <w:t xml:space="preserve">Bên triển khai: cài </w:t>
+            </w:r>
+            <w:r>
+              <w:rPr>
+                <w:b/>
+                <w:bCs/>
+              </w:rPr>
+              <w:t xml:space="preserve">Dokploy</w:t>
+            </w:r>
+            <w:r>
+              <w:t xml:space="preserve"> lên VPS → deploy app + MongoDB + MinIO → cấu hình HTTPS/Let's Encrypt + env (VNPay thật) → chạy kiểm thử đầy đủ</w:t>
             </w:r>
           </w:p>
         </w:tc>
@@ -12655,7 +12764,7 @@
         <w:spacing w:after="120"/>
       </w:pPr>
       <w:r>
-        <w:t xml:space="preserve">→ Có toàn bộ. Bạn sở hữu tài khoản MongoDB, R2, tên miền; mã nguồn được bàn giao đầy đủ.</w:t>
+        <w:t xml:space="preserve">→ Có toàn bộ. Bạn sở hữu VPS + tên miền (được bàn giao toàn quyền), dữ liệu nằm trong máy của bạn; mã nguồn được bàn giao đầy đủ.</w:t>
       </w:r>
     </w:p>
     <w:p>
@@ -12736,6 +12845,46 @@
       </w:pPr>
       <w:r>
         <w:t xml:space="preserve">→ Tự động ngay trong vài giây sau khi VNPay xác nhận (IPN). Cực hiếm trường hợp IPN trễ → đánh dấu thủ công trong 1 phút.</w:t>
+      </w:r>
+    </w:p>
+    <w:p>
+      <w:pPr>
+        <w:spacing w:after="120"/>
+      </w:pPr>
+      <w:r>
+        <w:rPr>
+          <w:b/>
+          <w:bCs/>
+        </w:rPr>
+        <w:t xml:space="preserve">Q6: Chi phí vận hành tối thiểu mỗi tháng là bao nhiêu?</w:t>
+      </w:r>
+    </w:p>
+    <w:p>
+      <w:pPr>
+        <w:spacing w:after="120"/>
+      </w:pPr>
+      <w:r>
+        <w:t xml:space="preserve">→ Chỉ cần </w:t>
+      </w:r>
+      <w:r>
+        <w:rPr>
+          <w:b/>
+          <w:bCs/>
+        </w:rPr>
+        <w:t xml:space="preserve">1 VPS (khoảng 200.000–450.000 VNĐ/tháng) + tên miền (~30.000 VNĐ/tháng quy đổi)</w:t>
+      </w:r>
+      <w:r>
+        <w:t xml:space="preserve"> — mọi thứ khác (MongoDB, lưu file, SSL) chạy ngay trên VPS qua Dokploy, miễn phí. Tổng ~</w:t>
+      </w:r>
+      <w:r>
+        <w:rPr>
+          <w:b/>
+          <w:bCs/>
+        </w:rPr>
+        <w:t xml:space="preserve">200.000–500.000 VNĐ/tháng</w:t>
+      </w:r>
+      <w:r>
+        <w:t xml:space="preserve">, cộng phí giao dịch VNPay theo từng đơn.</w:t>
       </w:r>
     </w:p>
     <w:p>

</xml_diff>